<commit_message>
Cut the Publicity guide down to the one-page, one-hour version
Board direction changed the shape of the role: reps pull classroom highlight
photos out of ClassDojo once a month and nothing else, capped at about an hour
a month, and Margot approves content before it is published.

Out: flyer distribution, event photography duties, sharing quotas, the
year-at-a-glance calendar, and asking reps to track photo permissions
themselves (the chair and board screen that at approval instead).

In: the monthly ClassDojo routine, the stated time cap, and the approval step.
Tightened heading and bullet spacing so it holds to a single page.

Co-Authored-By: Claude Opus 5 <noreply@anthropic.com>
Claude-Session: https://claude.ai/code/session_01Mf2SB2Y5NSpeF8hPhF3S57
</commit_message>
<xml_diff>
--- a/PublicityGdrive/WCP Publicity/Committee Docs/WCP Publicity Committee Guide 2026-2027.docx
+++ b/PublicityGdrive/WCP Publicity/Committee Docs/WCP Publicity Committee Guide 2026-2027.docx
@@ -55,7 +55,7 @@
     </w:p>
     <w:p>
       <w:pPr>
-        <w:spacing w:after="100" w:before="260"/>
+        <w:spacing w:after="80" w:before="190"/>
       </w:pPr>
       <w:r>
         <w:rPr>
@@ -82,12 +82,12 @@
           <w:sz w:val="21"/>
           <w:szCs w:val="21"/>
         </w:rPr>
-        <w:t xml:space="preserve">Publicity tells the WCP story, both to the families already here and to the families who have not found us yet. That covers photos and video at school events, social media, the website, the family newsletter, flyers and signs around West Chester, and anything else that carries the school name or logo. Enrollment is the reason this committee exists. A full school is what keeps tuition low and the co-op running, and most families find us through a photo, a post, or a friend sharing one.</w:t>
-      </w:r>
-    </w:p>
-    <w:p>
-      <w:pPr>
-        <w:spacing w:after="100" w:before="260"/>
+        <w:t xml:space="preserve">Publicity keeps West Chester Preschool visible, both to the families already here and to the families still looking for a preschool. Committee reps are the eyes inside the classroom. Once a month you pass along the best photos from your class so they can become posts. That is the job.</w:t>
+      </w:r>
+    </w:p>
+    <w:p>
+      <w:pPr>
+        <w:spacing w:after="80" w:before="190"/>
       </w:pPr>
       <w:r>
         <w:rPr>
@@ -99,7 +99,7 @@
           <w:szCs w:val="24"/>
           <w:u w:val="single"/>
         </w:rPr>
-        <w:t xml:space="preserve">Publicity Committee Instructions</w:t>
+        <w:t xml:space="preserve">Your Job, About One Hour a Month</w:t>
       </w:r>
     </w:p>
     <w:p>
@@ -109,7 +109,7 @@
           <w:ilvl w:val="0"/>
           <w:numId w:val="2"/>
         </w:numPr>
-        <w:spacing w:after="60"/>
+        <w:spacing w:after="40"/>
       </w:pPr>
       <w:r>
         <w:rPr>
@@ -119,7 +119,7 @@
           <w:sz w:val="21"/>
           <w:szCs w:val="21"/>
         </w:rPr>
-        <w:t xml:space="preserve">The chair holds the accounts. </w:t>
+        <w:t xml:space="preserve">Pull classroom highlights, about 45 minutes. </w:t>
       </w:r>
       <w:r>
         <w:rPr>
@@ -129,7 +129,7 @@
           <w:sz w:val="21"/>
           <w:szCs w:val="21"/>
         </w:rPr>
-        <w:t xml:space="preserve">Only the chair posts to the WCP Facebook and Instagram pages, the website, and the family email list, so the look and voice stay consistent and nothing private lands on the public web. Everything below is committee work, and all of it matters.</w:t>
+        <w:t xml:space="preserve">Once a month, scroll through your classroom's ClassDojo feed, pick 3 to 5 photos that show kids busy and happy, and drop them into the shared Publicity folder (link in the committee email). That is the heart of the role.</w:t>
       </w:r>
     </w:p>
     <w:p>
@@ -139,7 +139,7 @@
           <w:ilvl w:val="0"/>
           <w:numId w:val="2"/>
         </w:numPr>
-        <w:spacing w:after="60"/>
+        <w:spacing w:after="40"/>
       </w:pPr>
       <w:r>
         <w:rPr>
@@ -149,7 +149,7 @@
           <w:sz w:val="21"/>
           <w:szCs w:val="21"/>
         </w:rPr>
-        <w:t xml:space="preserve">Take photos at events you attend. </w:t>
+        <w:t xml:space="preserve">Share a post when you can, about 15 minutes. </w:t>
       </w:r>
       <w:r>
         <w:rPr>
@@ -159,152 +159,12 @@
           <w:sz w:val="21"/>
           <w:szCs w:val="21"/>
         </w:rPr>
-        <w:t xml:space="preserve">Phone photos are perfect. Send them to the chair within a day or two, while the event is still news. Candid shots of kids busy and happy work better than posed lineups, and a few seconds of video is gold for a reel.</w:t>
-      </w:r>
-    </w:p>
-    <w:p>
-      <w:pPr>
-        <w:pStyle w:val="ListParagraph"/>
-        <w:numPr>
-          <w:ilvl w:val="1"/>
-          <w:numId w:val="2"/>
-        </w:numPr>
-        <w:spacing w:after="60"/>
-      </w:pPr>
-      <w:r>
-        <w:rPr>
-          <w:rFonts w:ascii="Arial" w:cs="Arial" w:eastAsia="Arial" w:hAnsi="Arial"/>
-          <w:b w:val="false"/>
-          <w:bCs w:val="false"/>
-          <w:sz w:val="21"/>
-          <w:szCs w:val="21"/>
-        </w:rPr>
-        <w:t xml:space="preserve">Check the photo permission list before you shoot. A few families have opted out of photos. The chair keeps the current list and will share it at the start of the year. When in doubt, send the photo to the chair rather than posting it anywhere yourself.</w:t>
-      </w:r>
-    </w:p>
-    <w:p>
-      <w:pPr>
-        <w:pStyle w:val="ListParagraph"/>
-        <w:numPr>
-          <w:ilvl w:val="0"/>
-          <w:numId w:val="2"/>
-        </w:numPr>
-        <w:spacing w:after="60"/>
-      </w:pPr>
-      <w:r>
-        <w:rPr>
-          <w:rFonts w:ascii="Arial" w:cs="Arial" w:eastAsia="Arial" w:hAnsi="Arial"/>
-          <w:b/>
-          <w:bCs/>
-          <w:sz w:val="21"/>
-          <w:szCs w:val="21"/>
-        </w:rPr>
-        <w:t xml:space="preserve">Share every post. </w:t>
-      </w:r>
-      <w:r>
-        <w:rPr>
-          <w:rFonts w:ascii="Arial" w:cs="Arial" w:eastAsia="Arial" w:hAnsi="Arial"/>
-          <w:b w:val="false"/>
-          <w:bCs w:val="false"/>
-          <w:sz w:val="21"/>
-          <w:szCs w:val="21"/>
-        </w:rPr>
-        <w:t xml:space="preserve">Share WCP posts to your own page and into local parent groups: West Chester and Liberty Township community pages, moms groups, Buy Nothing groups, your neighborhood page, your church. This is the single highest-value thing a member can do, it costs nothing, and it is how most new families hear about us.</w:t>
-      </w:r>
-    </w:p>
-    <w:p>
-      <w:pPr>
-        <w:pStyle w:val="ListParagraph"/>
-        <w:numPr>
-          <w:ilvl w:val="0"/>
-          <w:numId w:val="2"/>
-        </w:numPr>
-        <w:spacing w:after="60"/>
-      </w:pPr>
-      <w:r>
-        <w:rPr>
-          <w:rFonts w:ascii="Arial" w:cs="Arial" w:eastAsia="Arial" w:hAnsi="Arial"/>
-          <w:b/>
-          <w:bCs/>
-          <w:sz w:val="21"/>
-          <w:szCs w:val="21"/>
-        </w:rPr>
-        <w:t xml:space="preserve">Help with the enrollment push, January through March. </w:t>
-      </w:r>
-      <w:r>
-        <w:rPr>
-          <w:rFonts w:ascii="Arial" w:cs="Arial" w:eastAsia="Arial" w:hAnsi="Arial"/>
-          <w:b w:val="false"/>
-          <w:bCs w:val="false"/>
-          <w:sz w:val="21"/>
-          <w:szCs w:val="21"/>
-        </w:rPr>
-        <w:t xml:space="preserve">This is the busy stretch. Members hang flyers and drop postcards at libraries, pediatric and dentist offices, coffee shops, gyms, churches, and community centers. The chair prints and supplies the materials, so members just need to deliver them.</w:t>
-      </w:r>
-    </w:p>
-    <w:p>
-      <w:pPr>
-        <w:pStyle w:val="ListParagraph"/>
-        <w:numPr>
-          <w:ilvl w:val="0"/>
-          <w:numId w:val="2"/>
-        </w:numPr>
-        <w:spacing w:after="60"/>
-      </w:pPr>
-      <w:r>
-        <w:rPr>
-          <w:rFonts w:ascii="Arial" w:cs="Arial" w:eastAsia="Arial" w:hAnsi="Arial"/>
-          <w:b/>
-          <w:bCs/>
-          <w:sz w:val="21"/>
-          <w:szCs w:val="21"/>
-        </w:rPr>
-        <w:t xml:space="preserve">Cover an event when the chair cannot. </w:t>
-      </w:r>
-      <w:r>
-        <w:rPr>
-          <w:rFonts w:ascii="Arial" w:cs="Arial" w:eastAsia="Arial" w:hAnsi="Arial"/>
-          <w:b w:val="false"/>
-          <w:bCs w:val="false"/>
-          <w:sz w:val="21"/>
-          <w:szCs w:val="21"/>
-        </w:rPr>
-        <w:t xml:space="preserve">If the chair is not able to be at a school event, one member volunteers to be the camera for that night. No experience needed, just a charged phone.</w:t>
-      </w:r>
-    </w:p>
-    <w:p>
-      <w:pPr>
-        <w:pStyle w:val="ListParagraph"/>
-        <w:numPr>
-          <w:ilvl w:val="0"/>
-          <w:numId w:val="2"/>
-        </w:numPr>
-        <w:spacing w:after="60"/>
-      </w:pPr>
-      <w:r>
-        <w:rPr>
-          <w:rFonts w:ascii="Arial" w:cs="Arial" w:eastAsia="Arial" w:hAnsi="Arial"/>
-          <w:b/>
-          <w:bCs/>
-          <w:sz w:val="21"/>
-          <w:szCs w:val="21"/>
-        </w:rPr>
-        <w:t xml:space="preserve">Bring ideas, and proofread. </w:t>
-      </w:r>
-      <w:r>
-        <w:rPr>
-          <w:rFonts w:ascii="Arial" w:cs="Arial" w:eastAsia="Arial" w:hAnsi="Arial"/>
-          <w:b w:val="false"/>
-          <w:bCs w:val="false"/>
-          <w:sz w:val="21"/>
-          <w:szCs w:val="21"/>
-        </w:rPr>
-        <w:t xml:space="preserve">Classroom milestones, a teacher doing something wonderful, an alumni family with good news, a community event we should be at. Pass it along. If you spot a typo or a wrong date on a post or flyer, text the chair right away.</w:t>
-      </w:r>
-    </w:p>
-    <w:p>
-      <w:pPr>
-        <w:spacing w:after="100" w:before="260"/>
+        <w:t xml:space="preserve">When WCP posts on Facebook or Instagram, share it to your own page or a local community group if it fits. No quota, just when it is easy.</w:t>
+      </w:r>
+    </w:p>
+    <w:p>
+      <w:pPr>
+        <w:spacing w:after="80" w:before="190"/>
       </w:pPr>
       <w:r>
         <w:rPr>
@@ -316,22 +176,7 @@
           <w:szCs w:val="24"/>
           <w:u w:val="single"/>
         </w:rPr>
-        <w:t xml:space="preserve">What the Chair Handles</w:t>
-      </w:r>
-    </w:p>
-    <w:p>
-      <w:pPr>
-        <w:spacing w:after="60"/>
-      </w:pPr>
-      <w:r>
-        <w:rPr>
-          <w:rFonts w:ascii="Arial" w:cs="Arial" w:eastAsia="Arial" w:hAnsi="Arial"/>
-          <w:i w:val="false"/>
-          <w:iCs w:val="false"/>
-          <w:sz w:val="21"/>
-          <w:szCs w:val="21"/>
-        </w:rPr>
-        <w:t xml:space="preserve">Listed so members know what is already covered and can ask to help with any of it:</w:t>
+        <w:t xml:space="preserve">Good to Know</w:t>
       </w:r>
     </w:p>
     <w:p>
@@ -341,8 +186,18 @@
           <w:ilvl w:val="0"/>
           <w:numId w:val="2"/>
         </w:numPr>
-        <w:spacing w:after="60"/>
-      </w:pPr>
+        <w:spacing w:after="40"/>
+      </w:pPr>
+      <w:r>
+        <w:rPr>
+          <w:rFonts w:ascii="Arial" w:cs="Arial" w:eastAsia="Arial" w:hAnsi="Arial"/>
+          <w:b/>
+          <w:bCs/>
+          <w:sz w:val="21"/>
+          <w:szCs w:val="21"/>
+        </w:rPr>
+        <w:t xml:space="preserve">Time: </w:t>
+      </w:r>
       <w:r>
         <w:rPr>
           <w:rFonts w:ascii="Arial" w:cs="Arial" w:eastAsia="Arial" w:hAnsi="Arial"/>
@@ -351,7 +206,7 @@
           <w:sz w:val="21"/>
           <w:szCs w:val="21"/>
         </w:rPr>
-        <w:t xml:space="preserve">Facebook and Instagram: the posting schedule, stories, reels, event promotion, and enrollment ads</w:t>
+        <w:t xml:space="preserve">this role is built for about one hour a month, roughly eight hours across the school year, and it can be done from your phone.</w:t>
       </w:r>
     </w:p>
     <w:p>
@@ -361,8 +216,18 @@
           <w:ilvl w:val="0"/>
           <w:numId w:val="2"/>
         </w:numPr>
-        <w:spacing w:after="60"/>
-      </w:pPr>
+        <w:spacing w:after="40"/>
+      </w:pPr>
+      <w:r>
+        <w:rPr>
+          <w:rFonts w:ascii="Arial" w:cs="Arial" w:eastAsia="Arial" w:hAnsi="Arial"/>
+          <w:b/>
+          <w:bCs/>
+          <w:sz w:val="21"/>
+          <w:szCs w:val="21"/>
+        </w:rPr>
+        <w:t xml:space="preserve">Approval: </w:t>
+      </w:r>
       <w:r>
         <w:rPr>
           <w:rFonts w:ascii="Arial" w:cs="Arial" w:eastAsia="Arial" w:hAnsi="Arial"/>
@@ -371,7 +236,7 @@
           <w:sz w:val="21"/>
           <w:szCs w:val="21"/>
         </w:rPr>
-        <w:t xml:space="preserve">The website: page edits, the calendar, announcements, and the family area</w:t>
+        <w:t xml:space="preserve">board leadership reviews content before it is published. Margot approves what goes on the school's pages, so nothing reaches the public without a board member seeing it first.</w:t>
       </w:r>
     </w:p>
     <w:p>
@@ -381,8 +246,18 @@
           <w:ilvl w:val="0"/>
           <w:numId w:val="2"/>
         </w:numPr>
-        <w:spacing w:after="60"/>
-      </w:pPr>
+        <w:spacing w:after="40"/>
+      </w:pPr>
+      <w:r>
+        <w:rPr>
+          <w:rFonts w:ascii="Arial" w:cs="Arial" w:eastAsia="Arial" w:hAnsi="Arial"/>
+          <w:b/>
+          <w:bCs/>
+          <w:sz w:val="21"/>
+          <w:szCs w:val="21"/>
+        </w:rPr>
+        <w:t xml:space="preserve">Photos: </w:t>
+      </w:r>
       <w:r>
         <w:rPr>
           <w:rFonts w:ascii="Arial" w:cs="Arial" w:eastAsia="Arial" w:hAnsi="Arial"/>
@@ -391,7 +266,7 @@
           <w:sz w:val="21"/>
           <w:szCs w:val="21"/>
         </w:rPr>
-        <w:t xml:space="preserve">The family newsletter and email announcements</w:t>
+        <w:t xml:space="preserve">send them to the shared folder rather than posting them yourself. The chair and board check photo permissions before anything is published, so it is not yours to track.</w:t>
       </w:r>
     </w:p>
     <w:p>
@@ -401,8 +276,18 @@
           <w:ilvl w:val="0"/>
           <w:numId w:val="2"/>
         </w:numPr>
-        <w:spacing w:after="60"/>
-      </w:pPr>
+        <w:spacing w:after="40"/>
+      </w:pPr>
+      <w:r>
+        <w:rPr>
+          <w:rFonts w:ascii="Arial" w:cs="Arial" w:eastAsia="Arial" w:hAnsi="Arial"/>
+          <w:b/>
+          <w:bCs/>
+          <w:sz w:val="21"/>
+          <w:szCs w:val="21"/>
+        </w:rPr>
+        <w:t xml:space="preserve">Experience: </w:t>
+      </w:r>
       <w:r>
         <w:rPr>
           <w:rFonts w:ascii="Arial" w:cs="Arial" w:eastAsia="Arial" w:hAnsi="Arial"/>
@@ -411,52 +296,12 @@
           <w:sz w:val="21"/>
           <w:szCs w:val="21"/>
         </w:rPr>
-        <w:t xml:space="preserve">Graphics, flyers, signs, and banners, all built in the WCP brand colors, fonts, and logo</w:t>
-      </w:r>
-    </w:p>
-    <w:p>
-      <w:pPr>
-        <w:pStyle w:val="ListParagraph"/>
-        <w:numPr>
-          <w:ilvl w:val="0"/>
-          <w:numId w:val="2"/>
-        </w:numPr>
-        <w:spacing w:after="60"/>
-      </w:pPr>
-      <w:r>
-        <w:rPr>
-          <w:rFonts w:ascii="Arial" w:cs="Arial" w:eastAsia="Arial" w:hAnsi="Arial"/>
-          <w:b w:val="false"/>
-          <w:bCs w:val="false"/>
-          <w:sz w:val="21"/>
-          <w:szCs w:val="21"/>
-        </w:rPr>
-        <w:t xml:space="preserve">Board headshots, class boards, and keeping the year's photos and graphics filed in the Publicity Google Drive</w:t>
-      </w:r>
-    </w:p>
-    <w:p>
-      <w:pPr>
-        <w:pStyle w:val="ListParagraph"/>
-        <w:numPr>
-          <w:ilvl w:val="0"/>
-          <w:numId w:val="2"/>
-        </w:numPr>
-        <w:spacing w:after="60"/>
-      </w:pPr>
-      <w:r>
-        <w:rPr>
-          <w:rFonts w:ascii="Arial" w:cs="Arial" w:eastAsia="Arial" w:hAnsi="Arial"/>
-          <w:b w:val="false"/>
-          <w:bCs w:val="false"/>
-          <w:sz w:val="21"/>
-          <w:szCs w:val="21"/>
-        </w:rPr>
-        <w:t xml:space="preserve">Community outreach: open house promotion, yard signs, local parent groups, and community events</w:t>
-      </w:r>
-    </w:p>
-    <w:p>
-      <w:pPr>
-        <w:spacing w:after="100" w:before="260"/>
+        <w:t xml:space="preserve">none needed. No design skills, no social media know-how. If you can use ClassDojo, you can do this job.</w:t>
+      </w:r>
+    </w:p>
+    <w:p>
+      <w:pPr>
+        <w:spacing w:after="80" w:before="190"/>
       </w:pPr>
       <w:r>
         <w:rPr>
@@ -468,402 +313,7 @@
           <w:szCs w:val="24"/>
           <w:u w:val="single"/>
         </w:rPr>
-        <w:t xml:space="preserve">The Publicity Year at a Glance</w:t>
-      </w:r>
-    </w:p>
-    <w:tbl>
-      <w:tblPr>
-        <w:tblW w:type="dxa" w:w="10080"/>
-        <w:tblBorders>
-          <w:top w:val="single" w:color="9AA5B1" w:sz="4"/>
-          <w:left w:val="single" w:color="9AA5B1" w:sz="4"/>
-          <w:bottom w:val="single" w:color="9AA5B1" w:sz="4"/>
-          <w:right w:val="single" w:color="9AA5B1" w:sz="4"/>
-          <w:insideH w:val="single" w:color="9AA5B1" w:sz="4"/>
-          <w:insideV w:val="single" w:color="9AA5B1" w:sz="4"/>
-        </w:tblBorders>
-      </w:tblPr>
-      <w:tblGrid>
-        <w:gridCol w:w="2300"/>
-        <w:gridCol w:w="7780"/>
-      </w:tblGrid>
-      <w:tr>
-        <w:trPr>
-          <w:tblHeader/>
-        </w:trPr>
-        <w:tc>
-          <w:tcPr>
-            <w:tcW w:type="dxa" w:w="2300"/>
-            <w:shd w:fill="01457E" w:color="auto" w:val="clear"/>
-            <w:tcMar>
-              <w:top w:type="dxa" w:w="60"/>
-              <w:left w:type="dxa" w:w="110"/>
-              <w:bottom w:type="dxa" w:w="60"/>
-              <w:right w:type="dxa" w:w="110"/>
-            </w:tcMar>
-          </w:tcPr>
-          <w:p>
-            <w:pPr>
-              <w:spacing w:after="0"/>
-            </w:pPr>
-            <w:r>
-              <w:rPr>
-                <w:rFonts w:ascii="Arial" w:cs="Arial" w:eastAsia="Arial" w:hAnsi="Arial"/>
-                <w:b/>
-                <w:bCs/>
-                <w:color w:val="FFFFFF"/>
-                <w:sz w:val="21"/>
-                <w:szCs w:val="21"/>
-              </w:rPr>
-              <w:t xml:space="preserve">When</w:t>
-            </w:r>
-          </w:p>
-        </w:tc>
-        <w:tc>
-          <w:tcPr>
-            <w:tcW w:type="dxa" w:w="7780"/>
-            <w:shd w:fill="01457E" w:color="auto" w:val="clear"/>
-            <w:tcMar>
-              <w:top w:type="dxa" w:w="60"/>
-              <w:left w:type="dxa" w:w="110"/>
-              <w:bottom w:type="dxa" w:w="60"/>
-              <w:right w:type="dxa" w:w="110"/>
-            </w:tcMar>
-          </w:tcPr>
-          <w:p>
-            <w:pPr>
-              <w:spacing w:after="0"/>
-            </w:pPr>
-            <w:r>
-              <w:rPr>
-                <w:rFonts w:ascii="Arial" w:cs="Arial" w:eastAsia="Arial" w:hAnsi="Arial"/>
-                <w:b/>
-                <w:bCs/>
-                <w:color w:val="FFFFFF"/>
-                <w:sz w:val="21"/>
-                <w:szCs w:val="21"/>
-              </w:rPr>
-              <w:t xml:space="preserve">Publicity Focus</w:t>
-            </w:r>
-          </w:p>
-        </w:tc>
-      </w:tr>
-      <w:tr>
-        <w:trPr>
-          <w:tblHeader w:val="false"/>
-        </w:trPr>
-        <w:tc>
-          <w:tcPr>
-            <w:tcW w:type="dxa" w:w="2300"/>
-            <w:tcMar>
-              <w:top w:type="dxa" w:w="60"/>
-              <w:left w:type="dxa" w:w="110"/>
-              <w:bottom w:type="dxa" w:w="60"/>
-              <w:right w:type="dxa" w:w="110"/>
-            </w:tcMar>
-          </w:tcPr>
-          <w:p>
-            <w:pPr>
-              <w:spacing w:after="0"/>
-            </w:pPr>
-            <w:r>
-              <w:rPr>
-                <w:rFonts w:ascii="Arial" w:cs="Arial" w:eastAsia="Arial" w:hAnsi="Arial"/>
-                <w:b w:val="false"/>
-                <w:bCs w:val="false"/>
-                <w:color w:val="000000"/>
-                <w:sz w:val="21"/>
-                <w:szCs w:val="21"/>
-              </w:rPr>
-              <w:t xml:space="preserve">Aug - Sept</w:t>
-            </w:r>
-          </w:p>
-        </w:tc>
-        <w:tc>
-          <w:tcPr>
-            <w:tcW w:type="dxa" w:w="7780"/>
-            <w:tcMar>
-              <w:top w:type="dxa" w:w="60"/>
-              <w:left w:type="dxa" w:w="110"/>
-              <w:bottom w:type="dxa" w:w="60"/>
-              <w:right w:type="dxa" w:w="110"/>
-            </w:tcMar>
-          </w:tcPr>
-          <w:p>
-            <w:pPr>
-              <w:spacing w:after="0"/>
-            </w:pPr>
-            <w:r>
-              <w:rPr>
-                <w:rFonts w:ascii="Arial" w:cs="Arial" w:eastAsia="Arial" w:hAnsi="Arial"/>
-                <w:b w:val="false"/>
-                <w:bCs w:val="false"/>
-                <w:color w:val="000000"/>
-                <w:sz w:val="21"/>
-                <w:szCs w:val="21"/>
-              </w:rPr>
-              <w:t xml:space="preserve">Welcome back posts, teacher introductions, first day photos, board headshots</w:t>
-            </w:r>
-          </w:p>
-        </w:tc>
-      </w:tr>
-      <w:tr>
-        <w:trPr>
-          <w:tblHeader w:val="false"/>
-        </w:trPr>
-        <w:tc>
-          <w:tcPr>
-            <w:tcW w:type="dxa" w:w="2300"/>
-            <w:tcMar>
-              <w:top w:type="dxa" w:w="60"/>
-              <w:left w:type="dxa" w:w="110"/>
-              <w:bottom w:type="dxa" w:w="60"/>
-              <w:right w:type="dxa" w:w="110"/>
-            </w:tcMar>
-          </w:tcPr>
-          <w:p>
-            <w:pPr>
-              <w:spacing w:after="0"/>
-            </w:pPr>
-            <w:r>
-              <w:rPr>
-                <w:rFonts w:ascii="Arial" w:cs="Arial" w:eastAsia="Arial" w:hAnsi="Arial"/>
-                <w:b w:val="false"/>
-                <w:bCs w:val="false"/>
-                <w:color w:val="000000"/>
-                <w:sz w:val="21"/>
-                <w:szCs w:val="21"/>
-              </w:rPr>
-              <w:t xml:space="preserve">Oct - Dec</w:t>
-            </w:r>
-          </w:p>
-        </w:tc>
-        <w:tc>
-          <w:tcPr>
-            <w:tcW w:type="dxa" w:w="7780"/>
-            <w:tcMar>
-              <w:top w:type="dxa" w:w="60"/>
-              <w:left w:type="dxa" w:w="110"/>
-              <w:bottom w:type="dxa" w:w="60"/>
-              <w:right w:type="dxa" w:w="110"/>
-            </w:tcMar>
-          </w:tcPr>
-          <w:p>
-            <w:pPr>
-              <w:spacing w:after="0"/>
-            </w:pPr>
-            <w:r>
-              <w:rPr>
-                <w:rFonts w:ascii="Arial" w:cs="Arial" w:eastAsia="Arial" w:hAnsi="Arial"/>
-                <w:b w:val="false"/>
-                <w:bCs w:val="false"/>
-                <w:color w:val="000000"/>
-                <w:sz w:val="21"/>
-                <w:szCs w:val="21"/>
-              </w:rPr>
-              <w:t xml:space="preserve">Fall VIP Night, classroom and holiday moments, fundraiser promotion</w:t>
-            </w:r>
-          </w:p>
-        </w:tc>
-      </w:tr>
-      <w:tr>
-        <w:trPr>
-          <w:tblHeader w:val="false"/>
-        </w:trPr>
-        <w:tc>
-          <w:tcPr>
-            <w:tcW w:type="dxa" w:w="2300"/>
-            <w:tcMar>
-              <w:top w:type="dxa" w:w="60"/>
-              <w:left w:type="dxa" w:w="110"/>
-              <w:bottom w:type="dxa" w:w="60"/>
-              <w:right w:type="dxa" w:w="110"/>
-            </w:tcMar>
-          </w:tcPr>
-          <w:p>
-            <w:pPr>
-              <w:spacing w:after="0"/>
-            </w:pPr>
-            <w:r>
-              <w:rPr>
-                <w:rFonts w:ascii="Arial" w:cs="Arial" w:eastAsia="Arial" w:hAnsi="Arial"/>
-                <w:b w:val="false"/>
-                <w:bCs w:val="false"/>
-                <w:color w:val="000000"/>
-                <w:sz w:val="21"/>
-                <w:szCs w:val="21"/>
-              </w:rPr>
-              <w:t xml:space="preserve">Jan - Mar</w:t>
-            </w:r>
-          </w:p>
-        </w:tc>
-        <w:tc>
-          <w:tcPr>
-            <w:tcW w:type="dxa" w:w="7780"/>
-            <w:tcMar>
-              <w:top w:type="dxa" w:w="60"/>
-              <w:left w:type="dxa" w:w="110"/>
-              <w:bottom w:type="dxa" w:w="60"/>
-              <w:right w:type="dxa" w:w="110"/>
-            </w:tcMar>
-          </w:tcPr>
-          <w:p>
-            <w:pPr>
-              <w:spacing w:after="0"/>
-            </w:pPr>
-            <w:r>
-              <w:rPr>
-                <w:rFonts w:ascii="Arial" w:cs="Arial" w:eastAsia="Arial" w:hAnsi="Arial"/>
-                <w:b w:val="false"/>
-                <w:bCs w:val="false"/>
-                <w:color w:val="000000"/>
-                <w:sz w:val="21"/>
-                <w:szCs w:val="21"/>
-              </w:rPr>
-              <w:t xml:space="preserve">Enrollment season: open house, registration dates, flyers and postcards out in the community, paid social ads. All hands on deck.</w:t>
-            </w:r>
-          </w:p>
-        </w:tc>
-      </w:tr>
-      <w:tr>
-        <w:trPr>
-          <w:tblHeader w:val="false"/>
-        </w:trPr>
-        <w:tc>
-          <w:tcPr>
-            <w:tcW w:type="dxa" w:w="2300"/>
-            <w:tcMar>
-              <w:top w:type="dxa" w:w="60"/>
-              <w:left w:type="dxa" w:w="110"/>
-              <w:bottom w:type="dxa" w:w="60"/>
-              <w:right w:type="dxa" w:w="110"/>
-            </w:tcMar>
-          </w:tcPr>
-          <w:p>
-            <w:pPr>
-              <w:spacing w:after="0"/>
-            </w:pPr>
-            <w:r>
-              <w:rPr>
-                <w:rFonts w:ascii="Arial" w:cs="Arial" w:eastAsia="Arial" w:hAnsi="Arial"/>
-                <w:b w:val="false"/>
-                <w:bCs w:val="false"/>
-                <w:color w:val="000000"/>
-                <w:sz w:val="21"/>
-                <w:szCs w:val="21"/>
-              </w:rPr>
-              <w:t xml:space="preserve">Apr - May</w:t>
-            </w:r>
-          </w:p>
-        </w:tc>
-        <w:tc>
-          <w:tcPr>
-            <w:tcW w:type="dxa" w:w="7780"/>
-            <w:tcMar>
-              <w:top w:type="dxa" w:w="60"/>
-              <w:left w:type="dxa" w:w="110"/>
-              <w:bottom w:type="dxa" w:w="60"/>
-              <w:right w:type="dxa" w:w="110"/>
-            </w:tcMar>
-          </w:tcPr>
-          <w:p>
-            <w:pPr>
-              <w:spacing w:after="0"/>
-            </w:pPr>
-            <w:r>
-              <w:rPr>
-                <w:rFonts w:ascii="Arial" w:cs="Arial" w:eastAsia="Arial" w:hAnsi="Arial"/>
-                <w:b w:val="false"/>
-                <w:bCs w:val="false"/>
-                <w:color w:val="000000"/>
-                <w:sz w:val="21"/>
-                <w:szCs w:val="21"/>
-              </w:rPr>
-              <w:t xml:space="preserve">Spring VIP Night, spring fundraiser, class photos, continued enrollment</w:t>
-            </w:r>
-          </w:p>
-        </w:tc>
-      </w:tr>
-      <w:tr>
-        <w:trPr>
-          <w:tblHeader w:val="false"/>
-        </w:trPr>
-        <w:tc>
-          <w:tcPr>
-            <w:tcW w:type="dxa" w:w="2300"/>
-            <w:tcMar>
-              <w:top w:type="dxa" w:w="60"/>
-              <w:left w:type="dxa" w:w="110"/>
-              <w:bottom w:type="dxa" w:w="60"/>
-              <w:right w:type="dxa" w:w="110"/>
-            </w:tcMar>
-          </w:tcPr>
-          <w:p>
-            <w:pPr>
-              <w:spacing w:after="0"/>
-            </w:pPr>
-            <w:r>
-              <w:rPr>
-                <w:rFonts w:ascii="Arial" w:cs="Arial" w:eastAsia="Arial" w:hAnsi="Arial"/>
-                <w:b w:val="false"/>
-                <w:bCs w:val="false"/>
-                <w:color w:val="000000"/>
-                <w:sz w:val="21"/>
-                <w:szCs w:val="21"/>
-              </w:rPr>
-              <w:t xml:space="preserve">May - June</w:t>
-            </w:r>
-          </w:p>
-        </w:tc>
-        <w:tc>
-          <w:tcPr>
-            <w:tcW w:type="dxa" w:w="7780"/>
-            <w:tcMar>
-              <w:top w:type="dxa" w:w="60"/>
-              <w:left w:type="dxa" w:w="110"/>
-              <w:bottom w:type="dxa" w:w="60"/>
-              <w:right w:type="dxa" w:w="110"/>
-            </w:tcMar>
-          </w:tcPr>
-          <w:p>
-            <w:pPr>
-              <w:spacing w:after="0"/>
-            </w:pPr>
-            <w:r>
-              <w:rPr>
-                <w:rFonts w:ascii="Arial" w:cs="Arial" w:eastAsia="Arial" w:hAnsi="Arial"/>
-                <w:b w:val="false"/>
-                <w:bCs w:val="false"/>
-                <w:color w:val="000000"/>
-                <w:sz w:val="21"/>
-                <w:szCs w:val="21"/>
-              </w:rPr>
-              <w:t xml:space="preserve">End of year picnic, graduation, thank-you posts, and handoff to next year's chair</w:t>
-            </w:r>
-          </w:p>
-        </w:tc>
-      </w:tr>
-    </w:tbl>
-    <w:p>
-      <w:pPr>
-        <w:spacing w:after="120"/>
-      </w:pPr>
-    </w:p>
-    <w:p>
-      <w:pPr>
-        <w:spacing w:after="100" w:before="260"/>
-      </w:pPr>
-      <w:r>
-        <w:rPr>
-          <w:rFonts w:ascii="Arial" w:cs="Arial" w:eastAsia="Arial" w:hAnsi="Arial"/>
-          <w:b/>
-          <w:bCs/>
-          <w:color w:val="01457E"/>
-          <w:sz w:val="24"/>
-          <w:szCs w:val="24"/>
-          <w:u w:val="single"/>
-        </w:rPr>
-        <w:t xml:space="preserve">Time Commitment</w:t>
+        <w:t xml:space="preserve">What the Chair Handles, So You Do Not Have To</w:t>
       </w:r>
     </w:p>
     <w:p>
@@ -873,7 +323,7 @@
           <w:ilvl w:val="0"/>
           <w:numId w:val="2"/>
         </w:numPr>
-        <w:spacing w:after="60"/>
+        <w:spacing w:after="40"/>
       </w:pPr>
       <w:r>
         <w:rPr>
@@ -883,7 +333,7 @@
           <w:sz w:val="21"/>
           <w:szCs w:val="21"/>
         </w:rPr>
-        <w:t xml:space="preserve">A few hours a month for most of the year, and more during the January through March enrollment push.</w:t>
+        <w:t xml:space="preserve">Posting and scheduling on Facebook and Instagram</w:t>
       </w:r>
     </w:p>
     <w:p>
@@ -893,7 +343,7 @@
           <w:ilvl w:val="0"/>
           <w:numId w:val="2"/>
         </w:numPr>
-        <w:spacing w:after="60"/>
+        <w:spacing w:after="40"/>
       </w:pPr>
       <w:r>
         <w:rPr>
@@ -903,24 +353,7 @@
           <w:sz w:val="21"/>
           <w:szCs w:val="21"/>
         </w:rPr>
-        <w:t xml:space="preserve">Most of the work can be done from your phone, on your own schedule. If you cannot attend an event, you can still help by sharing posts, distributing flyers, or prepping materials.</w:t>
-      </w:r>
-    </w:p>
-    <w:p>
-      <w:pPr>
-        <w:spacing w:after="100" w:before="260"/>
-      </w:pPr>
-      <w:r>
-        <w:rPr>
-          <w:rFonts w:ascii="Arial" w:cs="Arial" w:eastAsia="Arial" w:hAnsi="Arial"/>
-          <w:b/>
-          <w:bCs/>
-          <w:color w:val="01457E"/>
-          <w:sz w:val="24"/>
-          <w:szCs w:val="24"/>
-          <w:u w:val="single"/>
-        </w:rPr>
-        <w:t xml:space="preserve">Purchasing and Reimbursement</w:t>
+        <w:t xml:space="preserve">The website, the calendar, and family announcements</w:t>
       </w:r>
     </w:p>
     <w:p>
@@ -930,7 +363,7 @@
           <w:ilvl w:val="0"/>
           <w:numId w:val="2"/>
         </w:numPr>
-        <w:spacing w:after="60"/>
+        <w:spacing w:after="40"/>
       </w:pPr>
       <w:r>
         <w:rPr>
@@ -940,7 +373,7 @@
           <w:sz w:val="21"/>
           <w:szCs w:val="21"/>
         </w:rPr>
-        <w:t xml:space="preserve">Publicity has a budget for printing, signage, and social media ads. Check with the chair before spending, so we do not double up.</w:t>
+        <w:t xml:space="preserve">Graphics, flyers, signs, and enrollment materials</w:t>
       </w:r>
     </w:p>
     <w:p>
@@ -950,7 +383,7 @@
           <w:ilvl w:val="0"/>
           <w:numId w:val="2"/>
         </w:numPr>
-        <w:spacing w:after="60"/>
+        <w:spacing w:after="40"/>
       </w:pPr>
       <w:r>
         <w:rPr>
@@ -960,12 +393,12 @@
           <w:sz w:val="21"/>
           <w:szCs w:val="21"/>
         </w:rPr>
-        <w:t xml:space="preserve">Keep your receipts and give them to the VP or Treasurer for reimbursement. A board member can also purchase items with the school credit card if that is easier.</w:t>
-      </w:r>
-    </w:p>
-    <w:p>
-      <w:pPr>
-        <w:spacing w:after="100" w:before="260"/>
+        <w:t xml:space="preserve">Photos and video at school events, and filing the year's photos and graphics in the Publicity Google Drive</w:t>
+      </w:r>
+    </w:p>
+    <w:p>
+      <w:pPr>
+        <w:spacing w:after="80" w:before="190"/>
       </w:pPr>
       <w:r>
         <w:rPr>
@@ -1236,7 +669,7 @@
     </w:p>
     <w:p>
       <w:pPr>
-        <w:spacing w:after="100" w:before="260"/>
+        <w:spacing w:after="80" w:before="190"/>
       </w:pPr>
       <w:r>
         <w:rPr>
@@ -1856,7 +1289,7 @@
           <w:sz w:val="21"/>
           <w:szCs w:val="21"/>
         </w:rPr>
-        <w:t xml:space="preserve">Questions about anything in here, ask Nathan. Nothing on this list requires design or social media experience, just a phone and a willingness to talk up the school.</w:t>
+        <w:t xml:space="preserve">Questions, or a month where you cannot get to it? Text Nathan. A heads up ahead of time is always fine.</w:t>
       </w:r>
     </w:p>
     <w:sectPr>

</xml_diff>